<commit_message>
Add tee-count options comparison to final budget
Compares 30 tees vs 15 tees vs 15 tees re-deployed into cargo pants,
including per-item markup ranking (cargo 3.09x, tees 2.76x, polos 1.95x,
collar shirts 1.57x) and the luggage-weight caveat.

Co-authored-by: arena-agent <297053741+arena-agent@users.noreply.github.com>
</commit_message>
<xml_diff>
--- a/Final-Budget-and-Shop-Route.docx
+++ b/Final-Budget-and-Shop-Route.docx
@@ -1630,6 +1630,1717 @@
       </w:r>
       <w:r>
         <w:t xml:space="preserve"> the fashion items are what you want, but at Nairobi prices they sell in Kampala for roughly what they cost. The 30 tees are what actually generates your profit. Don't drop them.</w:t>
+      </w:r>
+    </w:p>
+    <w:p>
+      <w:pPr>
+        <w:pBdr>
+          <w:bottom w:val="single" w:sz="6" w:color="BFBFBF"/>
+        </w:pBdr>
+      </w:pPr>
+    </w:p>
+    <w:p>
+      <w:pPr>
+        <w:pStyle w:val="Heading1"/>
+      </w:pPr>
+      <w:r>
+        <w:t>3B. WHAT IF YOU CUT THE TEES TO 15?</w:t>
+      </w:r>
+    </w:p>
+    <w:p>
+      <w:pPr>
+        <w:spacing w:after="120"/>
+      </w:pPr>
+      <w:r>
+        <w:t xml:space="preserve">Cutting tees from 30 to 15 frees </w:t>
+      </w:r>
+      <w:r>
+        <w:rPr>
+          <w:b/>
+        </w:rPr>
+        <w:t>KSh 4,500</w:t>
+      </w:r>
+      <w:r>
+        <w:t>. You have three choices:</w:t>
+      </w:r>
+    </w:p>
+    <w:tbl>
+      <w:tblPr>
+        <w:tblStyle w:val="TableGrid"/>
+        <w:tblW w:type="auto" w:w="0"/>
+        <w:jc w:val="left"/>
+        <w:tblLook w:firstColumn="1" w:firstRow="1" w:lastColumn="0" w:lastRow="0" w:noHBand="0" w:noVBand="1" w:val="04A0"/>
+      </w:tblPr>
+      <w:tblGrid>
+        <w:gridCol w:w="2484"/>
+        <w:gridCol w:w="2484"/>
+        <w:gridCol w:w="2484"/>
+        <w:gridCol w:w="2484"/>
+      </w:tblGrid>
+      <w:tr>
+        <w:tc>
+          <w:tcPr>
+            <w:tcW w:type="dxa" w:w="2484"/>
+            <w:shd w:val="clear" w:color="auto" w:fill="E7EEF7"/>
+          </w:tcPr>
+          <w:p>
+            <w:pPr>
+              <w:spacing w:after="40"/>
+            </w:pPr>
+            <w:r>
+              <w:rPr>
+                <w:b/>
+                <w:sz w:val="19"/>
+              </w:rPr>
+            </w:r>
+          </w:p>
+        </w:tc>
+        <w:tc>
+          <w:tcPr>
+            <w:tcW w:type="dxa" w:w="2484"/>
+            <w:shd w:val="clear" w:color="auto" w:fill="E7EEF7"/>
+          </w:tcPr>
+          <w:p>
+            <w:pPr>
+              <w:spacing w:after="40"/>
+            </w:pPr>
+            <w:r>
+              <w:rPr>
+                <w:b/>
+                <w:sz w:val="19"/>
+              </w:rPr>
+            </w:r>
+            <w:r>
+              <w:rPr>
+                <w:b/>
+                <w:sz w:val="19"/>
+              </w:rPr>
+              <w:t>A — Original</w:t>
+            </w:r>
+            <w:r>
+              <w:rPr>
+                <w:b/>
+                <w:sz w:val="19"/>
+              </w:rPr>
+              <w:t xml:space="preserve"> (30 tees)</w:t>
+            </w:r>
+          </w:p>
+        </w:tc>
+        <w:tc>
+          <w:tcPr>
+            <w:tcW w:type="dxa" w:w="2484"/>
+            <w:shd w:val="clear" w:color="auto" w:fill="E7EEF7"/>
+          </w:tcPr>
+          <w:p>
+            <w:pPr>
+              <w:spacing w:after="40"/>
+            </w:pPr>
+            <w:r>
+              <w:rPr>
+                <w:b/>
+                <w:sz w:val="19"/>
+              </w:rPr>
+            </w:r>
+            <w:r>
+              <w:rPr>
+                <w:b/>
+                <w:sz w:val="19"/>
+              </w:rPr>
+              <w:t>B — 15 tees, keep cash</w:t>
+            </w:r>
+          </w:p>
+        </w:tc>
+        <w:tc>
+          <w:tcPr>
+            <w:tcW w:type="dxa" w:w="2484"/>
+            <w:shd w:val="clear" w:color="auto" w:fill="E7EEF7"/>
+          </w:tcPr>
+          <w:p>
+            <w:pPr>
+              <w:spacing w:after="40"/>
+            </w:pPr>
+            <w:r>
+              <w:rPr>
+                <w:b/>
+                <w:sz w:val="19"/>
+              </w:rPr>
+            </w:r>
+            <w:r>
+              <w:rPr>
+                <w:b/>
+                <w:sz w:val="19"/>
+              </w:rPr>
+              <w:t>C — 15 tees + 6 cargo</w:t>
+            </w:r>
+          </w:p>
+        </w:tc>
+      </w:tr>
+      <w:tr>
+        <w:tc>
+          <w:tcPr>
+            <w:tcW w:type="dxa" w:w="2484"/>
+          </w:tcPr>
+          <w:p>
+            <w:pPr>
+              <w:spacing w:after="40"/>
+            </w:pPr>
+            <w:r>
+              <w:rPr>
+                <w:sz w:val="19"/>
+              </w:rPr>
+            </w:r>
+            <w:r>
+              <w:rPr>
+                <w:sz w:val="19"/>
+              </w:rPr>
+              <w:t>Polos</w:t>
+            </w:r>
+          </w:p>
+        </w:tc>
+        <w:tc>
+          <w:tcPr>
+            <w:tcW w:type="dxa" w:w="2484"/>
+          </w:tcPr>
+          <w:p>
+            <w:pPr>
+              <w:spacing w:after="40"/>
+            </w:pPr>
+            <w:r>
+              <w:rPr>
+                <w:sz w:val="19"/>
+              </w:rPr>
+            </w:r>
+            <w:r>
+              <w:rPr>
+                <w:sz w:val="19"/>
+              </w:rPr>
+              <w:t>10</w:t>
+            </w:r>
+          </w:p>
+        </w:tc>
+        <w:tc>
+          <w:tcPr>
+            <w:tcW w:type="dxa" w:w="2484"/>
+          </w:tcPr>
+          <w:p>
+            <w:pPr>
+              <w:spacing w:after="40"/>
+            </w:pPr>
+            <w:r>
+              <w:rPr>
+                <w:sz w:val="19"/>
+              </w:rPr>
+            </w:r>
+            <w:r>
+              <w:rPr>
+                <w:sz w:val="19"/>
+              </w:rPr>
+              <w:t>10</w:t>
+            </w:r>
+          </w:p>
+        </w:tc>
+        <w:tc>
+          <w:tcPr>
+            <w:tcW w:type="dxa" w:w="2484"/>
+          </w:tcPr>
+          <w:p>
+            <w:pPr>
+              <w:spacing w:after="40"/>
+            </w:pPr>
+            <w:r>
+              <w:rPr>
+                <w:sz w:val="19"/>
+              </w:rPr>
+            </w:r>
+            <w:r>
+              <w:rPr>
+                <w:sz w:val="19"/>
+              </w:rPr>
+              <w:t>10</w:t>
+            </w:r>
+          </w:p>
+        </w:tc>
+      </w:tr>
+      <w:tr>
+        <w:tc>
+          <w:tcPr>
+            <w:tcW w:type="dxa" w:w="2484"/>
+          </w:tcPr>
+          <w:p>
+            <w:pPr>
+              <w:spacing w:after="40"/>
+            </w:pPr>
+            <w:r>
+              <w:rPr>
+                <w:sz w:val="19"/>
+              </w:rPr>
+            </w:r>
+            <w:r>
+              <w:rPr>
+                <w:sz w:val="19"/>
+              </w:rPr>
+              <w:t>Collar shirts</w:t>
+            </w:r>
+          </w:p>
+        </w:tc>
+        <w:tc>
+          <w:tcPr>
+            <w:tcW w:type="dxa" w:w="2484"/>
+          </w:tcPr>
+          <w:p>
+            <w:pPr>
+              <w:spacing w:after="40"/>
+            </w:pPr>
+            <w:r>
+              <w:rPr>
+                <w:sz w:val="19"/>
+              </w:rPr>
+            </w:r>
+            <w:r>
+              <w:rPr>
+                <w:sz w:val="19"/>
+              </w:rPr>
+              <w:t>6</w:t>
+            </w:r>
+          </w:p>
+        </w:tc>
+        <w:tc>
+          <w:tcPr>
+            <w:tcW w:type="dxa" w:w="2484"/>
+          </w:tcPr>
+          <w:p>
+            <w:pPr>
+              <w:spacing w:after="40"/>
+            </w:pPr>
+            <w:r>
+              <w:rPr>
+                <w:sz w:val="19"/>
+              </w:rPr>
+            </w:r>
+            <w:r>
+              <w:rPr>
+                <w:sz w:val="19"/>
+              </w:rPr>
+              <w:t>6</w:t>
+            </w:r>
+          </w:p>
+        </w:tc>
+        <w:tc>
+          <w:tcPr>
+            <w:tcW w:type="dxa" w:w="2484"/>
+          </w:tcPr>
+          <w:p>
+            <w:pPr>
+              <w:spacing w:after="40"/>
+            </w:pPr>
+            <w:r>
+              <w:rPr>
+                <w:sz w:val="19"/>
+              </w:rPr>
+            </w:r>
+            <w:r>
+              <w:rPr>
+                <w:sz w:val="19"/>
+              </w:rPr>
+              <w:t>6</w:t>
+            </w:r>
+          </w:p>
+        </w:tc>
+      </w:tr>
+      <w:tr>
+        <w:tc>
+          <w:tcPr>
+            <w:tcW w:type="dxa" w:w="2484"/>
+          </w:tcPr>
+          <w:p>
+            <w:pPr>
+              <w:spacing w:after="40"/>
+            </w:pPr>
+            <w:r>
+              <w:rPr>
+                <w:sz w:val="19"/>
+              </w:rPr>
+            </w:r>
+            <w:r>
+              <w:rPr>
+                <w:sz w:val="19"/>
+              </w:rPr>
+              <w:t>Cargo pants</w:t>
+            </w:r>
+          </w:p>
+        </w:tc>
+        <w:tc>
+          <w:tcPr>
+            <w:tcW w:type="dxa" w:w="2484"/>
+          </w:tcPr>
+          <w:p>
+            <w:pPr>
+              <w:spacing w:after="40"/>
+            </w:pPr>
+            <w:r>
+              <w:rPr>
+                <w:sz w:val="19"/>
+              </w:rPr>
+            </w:r>
+            <w:r>
+              <w:rPr>
+                <w:sz w:val="19"/>
+              </w:rPr>
+              <w:t>4</w:t>
+            </w:r>
+          </w:p>
+        </w:tc>
+        <w:tc>
+          <w:tcPr>
+            <w:tcW w:type="dxa" w:w="2484"/>
+          </w:tcPr>
+          <w:p>
+            <w:pPr>
+              <w:spacing w:after="40"/>
+            </w:pPr>
+            <w:r>
+              <w:rPr>
+                <w:sz w:val="19"/>
+              </w:rPr>
+            </w:r>
+            <w:r>
+              <w:rPr>
+                <w:sz w:val="19"/>
+              </w:rPr>
+              <w:t>4</w:t>
+            </w:r>
+          </w:p>
+        </w:tc>
+        <w:tc>
+          <w:tcPr>
+            <w:tcW w:type="dxa" w:w="2484"/>
+          </w:tcPr>
+          <w:p>
+            <w:pPr>
+              <w:spacing w:after="40"/>
+            </w:pPr>
+            <w:r>
+              <w:rPr>
+                <w:sz w:val="19"/>
+              </w:rPr>
+            </w:r>
+            <w:r>
+              <w:rPr>
+                <w:b/>
+                <w:sz w:val="19"/>
+              </w:rPr>
+              <w:t>10</w:t>
+            </w:r>
+          </w:p>
+        </w:tc>
+      </w:tr>
+      <w:tr>
+        <w:tc>
+          <w:tcPr>
+            <w:tcW w:type="dxa" w:w="2484"/>
+          </w:tcPr>
+          <w:p>
+            <w:pPr>
+              <w:spacing w:after="40"/>
+            </w:pPr>
+            <w:r>
+              <w:rPr>
+                <w:sz w:val="19"/>
+              </w:rPr>
+            </w:r>
+            <w:r>
+              <w:rPr>
+                <w:sz w:val="19"/>
+              </w:rPr>
+              <w:t>Plain tees</w:t>
+            </w:r>
+          </w:p>
+        </w:tc>
+        <w:tc>
+          <w:tcPr>
+            <w:tcW w:type="dxa" w:w="2484"/>
+          </w:tcPr>
+          <w:p>
+            <w:pPr>
+              <w:spacing w:after="40"/>
+            </w:pPr>
+            <w:r>
+              <w:rPr>
+                <w:sz w:val="19"/>
+              </w:rPr>
+            </w:r>
+            <w:r>
+              <w:rPr>
+                <w:sz w:val="19"/>
+              </w:rPr>
+              <w:t>30</w:t>
+            </w:r>
+          </w:p>
+        </w:tc>
+        <w:tc>
+          <w:tcPr>
+            <w:tcW w:type="dxa" w:w="2484"/>
+          </w:tcPr>
+          <w:p>
+            <w:pPr>
+              <w:spacing w:after="40"/>
+            </w:pPr>
+            <w:r>
+              <w:rPr>
+                <w:sz w:val="19"/>
+              </w:rPr>
+            </w:r>
+            <w:r>
+              <w:rPr>
+                <w:sz w:val="19"/>
+              </w:rPr>
+              <w:t>15</w:t>
+            </w:r>
+          </w:p>
+        </w:tc>
+        <w:tc>
+          <w:tcPr>
+            <w:tcW w:type="dxa" w:w="2484"/>
+          </w:tcPr>
+          <w:p>
+            <w:pPr>
+              <w:spacing w:after="40"/>
+            </w:pPr>
+            <w:r>
+              <w:rPr>
+                <w:sz w:val="19"/>
+              </w:rPr>
+            </w:r>
+            <w:r>
+              <w:rPr>
+                <w:sz w:val="19"/>
+              </w:rPr>
+              <w:t>15</w:t>
+            </w:r>
+          </w:p>
+        </w:tc>
+      </w:tr>
+      <w:tr>
+        <w:tc>
+          <w:tcPr>
+            <w:tcW w:type="dxa" w:w="2484"/>
+          </w:tcPr>
+          <w:p>
+            <w:pPr>
+              <w:spacing w:after="40"/>
+            </w:pPr>
+            <w:r>
+              <w:rPr>
+                <w:sz w:val="19"/>
+              </w:rPr>
+            </w:r>
+            <w:r>
+              <w:rPr>
+                <w:b/>
+                <w:sz w:val="19"/>
+              </w:rPr>
+              <w:t>Pieces</w:t>
+            </w:r>
+          </w:p>
+        </w:tc>
+        <w:tc>
+          <w:tcPr>
+            <w:tcW w:type="dxa" w:w="2484"/>
+          </w:tcPr>
+          <w:p>
+            <w:pPr>
+              <w:spacing w:after="40"/>
+            </w:pPr>
+            <w:r>
+              <w:rPr>
+                <w:sz w:val="19"/>
+              </w:rPr>
+            </w:r>
+            <w:r>
+              <w:rPr>
+                <w:b/>
+                <w:sz w:val="19"/>
+              </w:rPr>
+              <w:t>50</w:t>
+            </w:r>
+          </w:p>
+        </w:tc>
+        <w:tc>
+          <w:tcPr>
+            <w:tcW w:type="dxa" w:w="2484"/>
+          </w:tcPr>
+          <w:p>
+            <w:pPr>
+              <w:spacing w:after="40"/>
+            </w:pPr>
+            <w:r>
+              <w:rPr>
+                <w:sz w:val="19"/>
+              </w:rPr>
+            </w:r>
+            <w:r>
+              <w:rPr>
+                <w:b/>
+                <w:sz w:val="19"/>
+              </w:rPr>
+              <w:t>35</w:t>
+            </w:r>
+          </w:p>
+        </w:tc>
+        <w:tc>
+          <w:tcPr>
+            <w:tcW w:type="dxa" w:w="2484"/>
+          </w:tcPr>
+          <w:p>
+            <w:pPr>
+              <w:spacing w:after="40"/>
+            </w:pPr>
+            <w:r>
+              <w:rPr>
+                <w:sz w:val="19"/>
+              </w:rPr>
+            </w:r>
+            <w:r>
+              <w:rPr>
+                <w:b/>
+                <w:sz w:val="19"/>
+              </w:rPr>
+              <w:t>41</w:t>
+            </w:r>
+          </w:p>
+        </w:tc>
+      </w:tr>
+      <w:tr>
+        <w:tc>
+          <w:tcPr>
+            <w:tcW w:type="dxa" w:w="2484"/>
+          </w:tcPr>
+          <w:p>
+            <w:pPr>
+              <w:spacing w:after="40"/>
+            </w:pPr>
+            <w:r>
+              <w:rPr>
+                <w:sz w:val="19"/>
+              </w:rPr>
+            </w:r>
+            <w:r>
+              <w:rPr>
+                <w:b/>
+                <w:sz w:val="19"/>
+              </w:rPr>
+              <w:t>Stock cost</w:t>
+            </w:r>
+          </w:p>
+        </w:tc>
+        <w:tc>
+          <w:tcPr>
+            <w:tcW w:type="dxa" w:w="2484"/>
+          </w:tcPr>
+          <w:p>
+            <w:pPr>
+              <w:spacing w:after="40"/>
+            </w:pPr>
+            <w:r>
+              <w:rPr>
+                <w:sz w:val="19"/>
+              </w:rPr>
+            </w:r>
+            <w:r>
+              <w:rPr>
+                <w:sz w:val="19"/>
+              </w:rPr>
+              <w:t>KSh 26,200</w:t>
+            </w:r>
+          </w:p>
+        </w:tc>
+        <w:tc>
+          <w:tcPr>
+            <w:tcW w:type="dxa" w:w="2484"/>
+          </w:tcPr>
+          <w:p>
+            <w:pPr>
+              <w:spacing w:after="40"/>
+            </w:pPr>
+            <w:r>
+              <w:rPr>
+                <w:sz w:val="19"/>
+              </w:rPr>
+            </w:r>
+            <w:r>
+              <w:rPr>
+                <w:sz w:val="19"/>
+              </w:rPr>
+              <w:t>KSh 21,700</w:t>
+            </w:r>
+          </w:p>
+        </w:tc>
+        <w:tc>
+          <w:tcPr>
+            <w:tcW w:type="dxa" w:w="2484"/>
+          </w:tcPr>
+          <w:p>
+            <w:pPr>
+              <w:spacing w:after="40"/>
+            </w:pPr>
+            <w:r>
+              <w:rPr>
+                <w:sz w:val="19"/>
+              </w:rPr>
+            </w:r>
+            <w:r>
+              <w:rPr>
+                <w:sz w:val="19"/>
+              </w:rPr>
+              <w:t>KSh 26,200</w:t>
+            </w:r>
+          </w:p>
+        </w:tc>
+      </w:tr>
+      <w:tr>
+        <w:tc>
+          <w:tcPr>
+            <w:tcW w:type="dxa" w:w="2484"/>
+          </w:tcPr>
+          <w:p>
+            <w:pPr>
+              <w:spacing w:after="40"/>
+            </w:pPr>
+            <w:r>
+              <w:rPr>
+                <w:sz w:val="19"/>
+              </w:rPr>
+            </w:r>
+            <w:r>
+              <w:rPr>
+                <w:b/>
+                <w:sz w:val="19"/>
+              </w:rPr>
+              <w:t>Revenue</w:t>
+            </w:r>
+          </w:p>
+        </w:tc>
+        <w:tc>
+          <w:tcPr>
+            <w:tcW w:type="dxa" w:w="2484"/>
+          </w:tcPr>
+          <w:p>
+            <w:pPr>
+              <w:spacing w:after="40"/>
+            </w:pPr>
+            <w:r>
+              <w:rPr>
+                <w:sz w:val="19"/>
+              </w:rPr>
+            </w:r>
+            <w:r>
+              <w:rPr>
+                <w:sz w:val="19"/>
+              </w:rPr>
+              <w:t>1,800,000</w:t>
+            </w:r>
+          </w:p>
+        </w:tc>
+        <w:tc>
+          <w:tcPr>
+            <w:tcW w:type="dxa" w:w="2484"/>
+          </w:tcPr>
+          <w:p>
+            <w:pPr>
+              <w:spacing w:after="40"/>
+            </w:pPr>
+            <w:r>
+              <w:rPr>
+                <w:sz w:val="19"/>
+              </w:rPr>
+            </w:r>
+            <w:r>
+              <w:rPr>
+                <w:sz w:val="19"/>
+              </w:rPr>
+              <w:t>1,425,000</w:t>
+            </w:r>
+          </w:p>
+        </w:tc>
+        <w:tc>
+          <w:tcPr>
+            <w:tcW w:type="dxa" w:w="2484"/>
+          </w:tcPr>
+          <w:p>
+            <w:pPr>
+              <w:spacing w:after="40"/>
+            </w:pPr>
+            <w:r>
+              <w:rPr>
+                <w:sz w:val="19"/>
+              </w:rPr>
+            </w:r>
+            <w:r>
+              <w:rPr>
+                <w:b/>
+                <w:sz w:val="19"/>
+              </w:rPr>
+              <w:t>1,845,000</w:t>
+            </w:r>
+          </w:p>
+        </w:tc>
+      </w:tr>
+      <w:tr>
+        <w:tc>
+          <w:tcPr>
+            <w:tcW w:type="dxa" w:w="2484"/>
+          </w:tcPr>
+          <w:p>
+            <w:pPr>
+              <w:spacing w:after="40"/>
+            </w:pPr>
+            <w:r>
+              <w:rPr>
+                <w:sz w:val="19"/>
+              </w:rPr>
+            </w:r>
+            <w:r>
+              <w:rPr>
+                <w:b/>
+                <w:sz w:val="19"/>
+              </w:rPr>
+              <w:t>Profit — duty charged</w:t>
+            </w:r>
+          </w:p>
+        </w:tc>
+        <w:tc>
+          <w:tcPr>
+            <w:tcW w:type="dxa" w:w="2484"/>
+          </w:tcPr>
+          <w:p>
+            <w:pPr>
+              <w:spacing w:after="40"/>
+            </w:pPr>
+            <w:r>
+              <w:rPr>
+                <w:sz w:val="19"/>
+              </w:rPr>
+            </w:r>
+            <w:r>
+              <w:rPr>
+                <w:sz w:val="19"/>
+              </w:rPr>
+              <w:t>224,000</w:t>
+            </w:r>
+          </w:p>
+        </w:tc>
+        <w:tc>
+          <w:tcPr>
+            <w:tcW w:type="dxa" w:w="2484"/>
+          </w:tcPr>
+          <w:p>
+            <w:pPr>
+              <w:spacing w:after="40"/>
+            </w:pPr>
+            <w:r>
+              <w:rPr>
+                <w:sz w:val="19"/>
+              </w:rPr>
+            </w:r>
+            <w:r>
+              <w:rPr>
+                <w:b/>
+                <w:sz w:val="19"/>
+              </w:rPr>
+              <w:t>70,000</w:t>
+            </w:r>
+          </w:p>
+        </w:tc>
+        <w:tc>
+          <w:tcPr>
+            <w:tcW w:type="dxa" w:w="2484"/>
+          </w:tcPr>
+          <w:p>
+            <w:pPr>
+              <w:spacing w:after="40"/>
+            </w:pPr>
+            <w:r>
+              <w:rPr>
+                <w:sz w:val="19"/>
+              </w:rPr>
+            </w:r>
+            <w:r>
+              <w:rPr>
+                <w:b/>
+                <w:sz w:val="19"/>
+              </w:rPr>
+              <w:t>273,000</w:t>
+            </w:r>
+          </w:p>
+        </w:tc>
+      </w:tr>
+      <w:tr>
+        <w:tc>
+          <w:tcPr>
+            <w:tcW w:type="dxa" w:w="2484"/>
+          </w:tcPr>
+          <w:p>
+            <w:pPr>
+              <w:spacing w:after="40"/>
+            </w:pPr>
+            <w:r>
+              <w:rPr>
+                <w:sz w:val="19"/>
+              </w:rPr>
+            </w:r>
+            <w:r>
+              <w:rPr>
+                <w:b/>
+                <w:sz w:val="19"/>
+              </w:rPr>
+              <w:t>Profit — no duty</w:t>
+            </w:r>
+          </w:p>
+        </w:tc>
+        <w:tc>
+          <w:tcPr>
+            <w:tcW w:type="dxa" w:w="2484"/>
+          </w:tcPr>
+          <w:p>
+            <w:pPr>
+              <w:spacing w:after="40"/>
+            </w:pPr>
+            <w:r>
+              <w:rPr>
+                <w:sz w:val="19"/>
+              </w:rPr>
+            </w:r>
+            <w:r>
+              <w:rPr>
+                <w:sz w:val="19"/>
+              </w:rPr>
+              <w:t>698,000</w:t>
+            </w:r>
+          </w:p>
+        </w:tc>
+        <w:tc>
+          <w:tcPr>
+            <w:tcW w:type="dxa" w:w="2484"/>
+          </w:tcPr>
+          <w:p>
+            <w:pPr>
+              <w:spacing w:after="40"/>
+            </w:pPr>
+            <w:r>
+              <w:rPr>
+                <w:sz w:val="19"/>
+              </w:rPr>
+            </w:r>
+            <w:r>
+              <w:rPr>
+                <w:sz w:val="19"/>
+              </w:rPr>
+              <w:t>458,600</w:t>
+            </w:r>
+          </w:p>
+        </w:tc>
+        <w:tc>
+          <w:tcPr>
+            <w:tcW w:type="dxa" w:w="2484"/>
+          </w:tcPr>
+          <w:p>
+            <w:pPr>
+              <w:spacing w:after="40"/>
+            </w:pPr>
+            <w:r>
+              <w:rPr>
+                <w:sz w:val="19"/>
+              </w:rPr>
+            </w:r>
+            <w:r>
+              <w:rPr>
+                <w:b/>
+                <w:sz w:val="19"/>
+              </w:rPr>
+              <w:t>742,700</w:t>
+            </w:r>
+          </w:p>
+        </w:tc>
+      </w:tr>
+      <w:tr>
+        <w:tc>
+          <w:tcPr>
+            <w:tcW w:type="dxa" w:w="2484"/>
+          </w:tcPr>
+          <w:p>
+            <w:pPr>
+              <w:spacing w:after="40"/>
+            </w:pPr>
+            <w:r>
+              <w:rPr>
+                <w:sz w:val="19"/>
+              </w:rPr>
+            </w:r>
+            <w:r>
+              <w:rPr>
+                <w:sz w:val="19"/>
+              </w:rPr>
+              <w:t>Cash brought home</w:t>
+            </w:r>
+          </w:p>
+        </w:tc>
+        <w:tc>
+          <w:tcPr>
+            <w:tcW w:type="dxa" w:w="2484"/>
+          </w:tcPr>
+          <w:p>
+            <w:pPr>
+              <w:spacing w:after="40"/>
+            </w:pPr>
+            <w:r>
+              <w:rPr>
+                <w:sz w:val="19"/>
+              </w:rPr>
+            </w:r>
+            <w:r>
+              <w:rPr>
+                <w:sz w:val="19"/>
+              </w:rPr>
+              <w:t>~1,000</w:t>
+            </w:r>
+          </w:p>
+        </w:tc>
+        <w:tc>
+          <w:tcPr>
+            <w:tcW w:type="dxa" w:w="2484"/>
+          </w:tcPr>
+          <w:p>
+            <w:pPr>
+              <w:spacing w:after="40"/>
+            </w:pPr>
+            <w:r>
+              <w:rPr>
+                <w:sz w:val="19"/>
+              </w:rPr>
+            </w:r>
+            <w:r>
+              <w:rPr>
+                <w:sz w:val="19"/>
+              </w:rPr>
+              <w:t>8,132</w:t>
+            </w:r>
+          </w:p>
+        </w:tc>
+        <w:tc>
+          <w:tcPr>
+            <w:tcW w:type="dxa" w:w="2484"/>
+          </w:tcPr>
+          <w:p>
+            <w:pPr>
+              <w:spacing w:after="40"/>
+            </w:pPr>
+            <w:r>
+              <w:rPr>
+                <w:sz w:val="19"/>
+              </w:rPr>
+            </w:r>
+            <w:r>
+              <w:rPr>
+                <w:sz w:val="19"/>
+              </w:rPr>
+              <w:t>~963</w:t>
+            </w:r>
+          </w:p>
+        </w:tc>
+      </w:tr>
+    </w:tbl>
+    <w:p/>
+    <w:p>
+      <w:pPr>
+        <w:pStyle w:val="Heading2"/>
+      </w:pPr>
+      <w:r>
+        <w:t>Why Option B hurts so much</w:t>
+      </w:r>
+    </w:p>
+    <w:p>
+      <w:pPr>
+        <w:spacing w:after="120"/>
+      </w:pPr>
+      <w:r>
+        <w:t xml:space="preserve">The tees weren't just filler — </w:t>
+      </w:r>
+      <w:r>
+        <w:rPr>
+          <w:b/>
+        </w:rPr>
+        <w:t>they were carrying most of your margin.</w:t>
+      </w:r>
+      <w:r>
+        <w:t xml:space="preserve"> Not buying them doesn't save you money; it just means you carry cash home instead of goods that double in value.</w:t>
+      </w:r>
+    </w:p>
+    <w:p>
+      <w:pPr>
+        <w:pStyle w:val="Heading2"/>
+      </w:pPr>
+      <w:r>
+        <w:t>Why Option C is actually the best</w:t>
+      </w:r>
+    </w:p>
+    <w:p>
+      <w:pPr>
+        <w:spacing w:after="120"/>
+      </w:pPr>
+      <w:r>
+        <w:rPr>
+          <w:b/>
+        </w:rPr>
+        <w:t>Cargo pants have the best markup of anything on your list:</w:t>
+      </w:r>
+    </w:p>
+    <w:tbl>
+      <w:tblPr>
+        <w:tblStyle w:val="TableGrid"/>
+        <w:tblW w:type="auto" w:w="0"/>
+        <w:jc w:val="left"/>
+        <w:tblLook w:firstColumn="1" w:firstRow="1" w:lastColumn="0" w:lastRow="0" w:noHBand="0" w:noVBand="1" w:val="04A0"/>
+      </w:tblPr>
+      <w:tblGrid>
+        <w:gridCol w:w="1987"/>
+        <w:gridCol w:w="1987"/>
+        <w:gridCol w:w="1987"/>
+        <w:gridCol w:w="1987"/>
+        <w:gridCol w:w="1987"/>
+      </w:tblGrid>
+      <w:tr>
+        <w:tc>
+          <w:tcPr>
+            <w:tcW w:type="dxa" w:w="1987"/>
+            <w:shd w:val="clear" w:color="auto" w:fill="E7EEF7"/>
+          </w:tcPr>
+          <w:p>
+            <w:pPr>
+              <w:spacing w:after="40"/>
+            </w:pPr>
+            <w:r>
+              <w:rPr>
+                <w:b/>
+                <w:sz w:val="19"/>
+              </w:rPr>
+            </w:r>
+            <w:r>
+              <w:rPr>
+                <w:b/>
+                <w:sz w:val="19"/>
+              </w:rPr>
+              <w:t>Item</w:t>
+            </w:r>
+          </w:p>
+        </w:tc>
+        <w:tc>
+          <w:tcPr>
+            <w:tcW w:type="dxa" w:w="1987"/>
+            <w:shd w:val="clear" w:color="auto" w:fill="E7EEF7"/>
+          </w:tcPr>
+          <w:p>
+            <w:pPr>
+              <w:spacing w:after="40"/>
+            </w:pPr>
+            <w:r>
+              <w:rPr>
+                <w:b/>
+                <w:sz w:val="19"/>
+              </w:rPr>
+            </w:r>
+            <w:r>
+              <w:rPr>
+                <w:b/>
+                <w:sz w:val="19"/>
+              </w:rPr>
+              <w:t>Buy</w:t>
+            </w:r>
+          </w:p>
+        </w:tc>
+        <w:tc>
+          <w:tcPr>
+            <w:tcW w:type="dxa" w:w="1987"/>
+            <w:shd w:val="clear" w:color="auto" w:fill="E7EEF7"/>
+          </w:tcPr>
+          <w:p>
+            <w:pPr>
+              <w:spacing w:after="40"/>
+            </w:pPr>
+            <w:r>
+              <w:rPr>
+                <w:b/>
+                <w:sz w:val="19"/>
+              </w:rPr>
+            </w:r>
+            <w:r>
+              <w:rPr>
+                <w:b/>
+                <w:sz w:val="19"/>
+              </w:rPr>
+              <w:t>Sell</w:t>
+            </w:r>
+          </w:p>
+        </w:tc>
+        <w:tc>
+          <w:tcPr>
+            <w:tcW w:type="dxa" w:w="1987"/>
+            <w:shd w:val="clear" w:color="auto" w:fill="E7EEF7"/>
+          </w:tcPr>
+          <w:p>
+            <w:pPr>
+              <w:spacing w:after="40"/>
+            </w:pPr>
+            <w:r>
+              <w:rPr>
+                <w:b/>
+                <w:sz w:val="19"/>
+              </w:rPr>
+            </w:r>
+            <w:r>
+              <w:rPr>
+                <w:b/>
+                <w:sz w:val="19"/>
+              </w:rPr>
+              <w:t>Margin per piece</w:t>
+            </w:r>
+          </w:p>
+        </w:tc>
+        <w:tc>
+          <w:tcPr>
+            <w:tcW w:type="dxa" w:w="1987"/>
+            <w:shd w:val="clear" w:color="auto" w:fill="E7EEF7"/>
+          </w:tcPr>
+          <w:p>
+            <w:pPr>
+              <w:spacing w:after="40"/>
+            </w:pPr>
+            <w:r>
+              <w:rPr>
+                <w:b/>
+                <w:sz w:val="19"/>
+              </w:rPr>
+            </w:r>
+            <w:r>
+              <w:rPr>
+                <w:b/>
+                <w:sz w:val="19"/>
+              </w:rPr>
+              <w:t>Markup</w:t>
+            </w:r>
+          </w:p>
+        </w:tc>
+      </w:tr>
+      <w:tr>
+        <w:tc>
+          <w:tcPr>
+            <w:tcW w:type="dxa" w:w="1987"/>
+          </w:tcPr>
+          <w:p>
+            <w:pPr>
+              <w:spacing w:after="40"/>
+            </w:pPr>
+            <w:r>
+              <w:rPr>
+                <w:sz w:val="19"/>
+              </w:rPr>
+            </w:r>
+            <w:r>
+              <w:rPr>
+                <w:b/>
+                <w:sz w:val="19"/>
+              </w:rPr>
+              <w:t>Cargo pants</w:t>
+            </w:r>
+          </w:p>
+        </w:tc>
+        <w:tc>
+          <w:tcPr>
+            <w:tcW w:type="dxa" w:w="1987"/>
+          </w:tcPr>
+          <w:p>
+            <w:pPr>
+              <w:spacing w:after="40"/>
+            </w:pPr>
+            <w:r>
+              <w:rPr>
+                <w:sz w:val="19"/>
+              </w:rPr>
+            </w:r>
+            <w:r>
+              <w:rPr>
+                <w:sz w:val="19"/>
+              </w:rPr>
+              <w:t>KSh 750 (22,650 UGX)</w:t>
+            </w:r>
+          </w:p>
+        </w:tc>
+        <w:tc>
+          <w:tcPr>
+            <w:tcW w:type="dxa" w:w="1987"/>
+          </w:tcPr>
+          <w:p>
+            <w:pPr>
+              <w:spacing w:after="40"/>
+            </w:pPr>
+            <w:r>
+              <w:rPr>
+                <w:sz w:val="19"/>
+              </w:rPr>
+            </w:r>
+            <w:r>
+              <w:rPr>
+                <w:sz w:val="19"/>
+              </w:rPr>
+              <w:t>70,000</w:t>
+            </w:r>
+          </w:p>
+        </w:tc>
+        <w:tc>
+          <w:tcPr>
+            <w:tcW w:type="dxa" w:w="1987"/>
+          </w:tcPr>
+          <w:p>
+            <w:pPr>
+              <w:spacing w:after="40"/>
+            </w:pPr>
+            <w:r>
+              <w:rPr>
+                <w:sz w:val="19"/>
+              </w:rPr>
+            </w:r>
+            <w:r>
+              <w:rPr>
+                <w:b/>
+                <w:sz w:val="19"/>
+              </w:rPr>
+              <w:t>47,350 UGX</w:t>
+            </w:r>
+          </w:p>
+        </w:tc>
+        <w:tc>
+          <w:tcPr>
+            <w:tcW w:type="dxa" w:w="1987"/>
+          </w:tcPr>
+          <w:p>
+            <w:pPr>
+              <w:spacing w:after="40"/>
+            </w:pPr>
+            <w:r>
+              <w:rPr>
+                <w:sz w:val="19"/>
+              </w:rPr>
+            </w:r>
+            <w:r>
+              <w:rPr>
+                <w:b/>
+                <w:sz w:val="19"/>
+              </w:rPr>
+              <w:t>3.09×</w:t>
+            </w:r>
+          </w:p>
+        </w:tc>
+      </w:tr>
+      <w:tr>
+        <w:tc>
+          <w:tcPr>
+            <w:tcW w:type="dxa" w:w="1987"/>
+          </w:tcPr>
+          <w:p>
+            <w:pPr>
+              <w:spacing w:after="40"/>
+            </w:pPr>
+            <w:r>
+              <w:rPr>
+                <w:sz w:val="19"/>
+              </w:rPr>
+            </w:r>
+            <w:r>
+              <w:rPr>
+                <w:sz w:val="19"/>
+              </w:rPr>
+              <w:t>Plain tees</w:t>
+            </w:r>
+          </w:p>
+        </w:tc>
+        <w:tc>
+          <w:tcPr>
+            <w:tcW w:type="dxa" w:w="1987"/>
+          </w:tcPr>
+          <w:p>
+            <w:pPr>
+              <w:spacing w:after="40"/>
+            </w:pPr>
+            <w:r>
+              <w:rPr>
+                <w:sz w:val="19"/>
+              </w:rPr>
+            </w:r>
+            <w:r>
+              <w:rPr>
+                <w:sz w:val="19"/>
+              </w:rPr>
+              <w:t>KSh 300 (9,060 UGX)</w:t>
+            </w:r>
+          </w:p>
+        </w:tc>
+        <w:tc>
+          <w:tcPr>
+            <w:tcW w:type="dxa" w:w="1987"/>
+          </w:tcPr>
+          <w:p>
+            <w:pPr>
+              <w:spacing w:after="40"/>
+            </w:pPr>
+            <w:r>
+              <w:rPr>
+                <w:sz w:val="19"/>
+              </w:rPr>
+            </w:r>
+            <w:r>
+              <w:rPr>
+                <w:sz w:val="19"/>
+              </w:rPr>
+              <w:t>25,000</w:t>
+            </w:r>
+          </w:p>
+        </w:tc>
+        <w:tc>
+          <w:tcPr>
+            <w:tcW w:type="dxa" w:w="1987"/>
+          </w:tcPr>
+          <w:p>
+            <w:pPr>
+              <w:spacing w:after="40"/>
+            </w:pPr>
+            <w:r>
+              <w:rPr>
+                <w:sz w:val="19"/>
+              </w:rPr>
+            </w:r>
+            <w:r>
+              <w:rPr>
+                <w:sz w:val="19"/>
+              </w:rPr>
+              <w:t>15,940 UGX</w:t>
+            </w:r>
+          </w:p>
+        </w:tc>
+        <w:tc>
+          <w:tcPr>
+            <w:tcW w:type="dxa" w:w="1987"/>
+          </w:tcPr>
+          <w:p>
+            <w:pPr>
+              <w:spacing w:after="40"/>
+            </w:pPr>
+            <w:r>
+              <w:rPr>
+                <w:sz w:val="19"/>
+              </w:rPr>
+            </w:r>
+            <w:r>
+              <w:rPr>
+                <w:sz w:val="19"/>
+              </w:rPr>
+              <w:t>2.76×</w:t>
+            </w:r>
+          </w:p>
+        </w:tc>
+      </w:tr>
+      <w:tr>
+        <w:tc>
+          <w:tcPr>
+            <w:tcW w:type="dxa" w:w="1987"/>
+          </w:tcPr>
+          <w:p>
+            <w:pPr>
+              <w:spacing w:after="40"/>
+            </w:pPr>
+            <w:r>
+              <w:rPr>
+                <w:sz w:val="19"/>
+              </w:rPr>
+            </w:r>
+            <w:r>
+              <w:rPr>
+                <w:sz w:val="19"/>
+              </w:rPr>
+              <w:t>Fashion polos</w:t>
+            </w:r>
+          </w:p>
+        </w:tc>
+        <w:tc>
+          <w:tcPr>
+            <w:tcW w:type="dxa" w:w="1987"/>
+          </w:tcPr>
+          <w:p>
+            <w:pPr>
+              <w:spacing w:after="40"/>
+            </w:pPr>
+            <w:r>
+              <w:rPr>
+                <w:sz w:val="19"/>
+              </w:rPr>
+            </w:r>
+            <w:r>
+              <w:rPr>
+                <w:sz w:val="19"/>
+              </w:rPr>
+              <w:t>KSh 850 (25,670 UGX)</w:t>
+            </w:r>
+          </w:p>
+        </w:tc>
+        <w:tc>
+          <w:tcPr>
+            <w:tcW w:type="dxa" w:w="1987"/>
+          </w:tcPr>
+          <w:p>
+            <w:pPr>
+              <w:spacing w:after="40"/>
+            </w:pPr>
+            <w:r>
+              <w:rPr>
+                <w:sz w:val="19"/>
+              </w:rPr>
+            </w:r>
+            <w:r>
+              <w:rPr>
+                <w:sz w:val="19"/>
+              </w:rPr>
+              <w:t>50,000</w:t>
+            </w:r>
+          </w:p>
+        </w:tc>
+        <w:tc>
+          <w:tcPr>
+            <w:tcW w:type="dxa" w:w="1987"/>
+          </w:tcPr>
+          <w:p>
+            <w:pPr>
+              <w:spacing w:after="40"/>
+            </w:pPr>
+            <w:r>
+              <w:rPr>
+                <w:sz w:val="19"/>
+              </w:rPr>
+            </w:r>
+            <w:r>
+              <w:rPr>
+                <w:sz w:val="19"/>
+              </w:rPr>
+              <w:t>24,330 UGX</w:t>
+            </w:r>
+          </w:p>
+        </w:tc>
+        <w:tc>
+          <w:tcPr>
+            <w:tcW w:type="dxa" w:w="1987"/>
+          </w:tcPr>
+          <w:p>
+            <w:pPr>
+              <w:spacing w:after="40"/>
+            </w:pPr>
+            <w:r>
+              <w:rPr>
+                <w:sz w:val="19"/>
+              </w:rPr>
+            </w:r>
+            <w:r>
+              <w:rPr>
+                <w:sz w:val="19"/>
+              </w:rPr>
+              <w:t>1.95×</w:t>
+            </w:r>
+          </w:p>
+        </w:tc>
+      </w:tr>
+      <w:tr>
+        <w:tc>
+          <w:tcPr>
+            <w:tcW w:type="dxa" w:w="1987"/>
+          </w:tcPr>
+          <w:p>
+            <w:pPr>
+              <w:spacing w:after="40"/>
+            </w:pPr>
+            <w:r>
+              <w:rPr>
+                <w:sz w:val="19"/>
+              </w:rPr>
+            </w:r>
+            <w:r>
+              <w:rPr>
+                <w:sz w:val="19"/>
+              </w:rPr>
+              <w:t>Collar shirts</w:t>
+            </w:r>
+          </w:p>
+        </w:tc>
+        <w:tc>
+          <w:tcPr>
+            <w:tcW w:type="dxa" w:w="1987"/>
+          </w:tcPr>
+          <w:p>
+            <w:pPr>
+              <w:spacing w:after="40"/>
+            </w:pPr>
+            <w:r>
+              <w:rPr>
+                <w:sz w:val="19"/>
+              </w:rPr>
+            </w:r>
+            <w:r>
+              <w:rPr>
+                <w:sz w:val="19"/>
+              </w:rPr>
+              <w:t>KSh 950 (28,690 UGX)</w:t>
+            </w:r>
+          </w:p>
+        </w:tc>
+        <w:tc>
+          <w:tcPr>
+            <w:tcW w:type="dxa" w:w="1987"/>
+          </w:tcPr>
+          <w:p>
+            <w:pPr>
+              <w:spacing w:after="40"/>
+            </w:pPr>
+            <w:r>
+              <w:rPr>
+                <w:sz w:val="19"/>
+              </w:rPr>
+            </w:r>
+            <w:r>
+              <w:rPr>
+                <w:sz w:val="19"/>
+              </w:rPr>
+              <w:t>45,000</w:t>
+            </w:r>
+          </w:p>
+        </w:tc>
+        <w:tc>
+          <w:tcPr>
+            <w:tcW w:type="dxa" w:w="1987"/>
+          </w:tcPr>
+          <w:p>
+            <w:pPr>
+              <w:spacing w:after="40"/>
+            </w:pPr>
+            <w:r>
+              <w:rPr>
+                <w:sz w:val="19"/>
+              </w:rPr>
+            </w:r>
+            <w:r>
+              <w:rPr>
+                <w:sz w:val="19"/>
+              </w:rPr>
+              <w:t>16,310 UGX</w:t>
+            </w:r>
+          </w:p>
+        </w:tc>
+        <w:tc>
+          <w:tcPr>
+            <w:tcW w:type="dxa" w:w="1987"/>
+          </w:tcPr>
+          <w:p>
+            <w:pPr>
+              <w:spacing w:after="40"/>
+            </w:pPr>
+            <w:r>
+              <w:rPr>
+                <w:sz w:val="19"/>
+              </w:rPr>
+            </w:r>
+            <w:r>
+              <w:rPr>
+                <w:b/>
+                <w:sz w:val="19"/>
+              </w:rPr>
+              <w:t>1.57×</w:t>
+            </w:r>
+          </w:p>
+        </w:tc>
+      </w:tr>
+    </w:tbl>
+    <w:p/>
+    <w:p>
+      <w:pPr>
+        <w:spacing w:after="120"/>
+      </w:pPr>
+      <w:r>
+        <w:t xml:space="preserve">So cutting 15 tees and putting the KSh 4,500 into </w:t>
+      </w:r>
+      <w:r>
+        <w:rPr>
+          <w:b/>
+        </w:rPr>
+        <w:t>6 more cargo pants</w:t>
+      </w:r>
+      <w:r>
+        <w:t xml:space="preserve"> raises your profit above the original plan.</w:t>
+      </w:r>
+    </w:p>
+    <w:p>
+      <w:pPr>
+        <w:spacing w:after="120"/>
+        <w:ind w:left="432"/>
+      </w:pPr>
+      <w:r>
+        <w:rPr>
+          <w:b/>
+          <w:i/>
+          <w:color w:val="444444"/>
+        </w:rPr>
+        <w:t>The catch:</w:t>
+      </w:r>
+      <w:r>
+        <w:rPr>
+          <w:i/>
+          <w:color w:val="444444"/>
+        </w:rPr>
+        <w:t xml:space="preserve"> cargo pants are bulky and heavy, and at UGX 70,000 they sell slower than tees. 10 pairs is a lot to carry and may sit on your shelf. Tees move fast; cargo makes more per piece.</w:t>
+      </w:r>
+    </w:p>
+    <w:p>
+      <w:pPr>
+        <w:spacing w:after="120"/>
+        <w:ind w:left="432"/>
+      </w:pPr>
+    </w:p>
+    <w:p>
+      <w:pPr>
+        <w:spacing w:after="120"/>
+        <w:ind w:left="432"/>
+      </w:pPr>
+      <w:r>
+        <w:rPr>
+          <w:b/>
+          <w:i/>
+          <w:color w:val="444444"/>
+        </w:rPr>
+        <w:t>Balanced call: do Option C but watch your luggage weight.</w:t>
+      </w:r>
+      <w:r>
+        <w:rPr>
+          <w:i/>
+          <w:color w:val="444444"/>
+        </w:rPr>
+        <w:t xml:space="preserve"> If you're already loaded, do Option B and accept the lower profit — don't pay excess baggage fees.</w:t>
+      </w:r>
+    </w:p>
+    <w:p>
+      <w:pPr>
+        <w:spacing w:after="120"/>
+      </w:pPr>
+      <w:r>
+        <w:rPr>
+          <w:b/>
+        </w:rPr>
+        <w:t>Recommendation: Option C</w:t>
+      </w:r>
+      <w:r>
+        <w:t>, or split the difference — 15 tees and 8 cargo pants (stock KSh 24,700, profit ≈ 250,000).</w:t>
       </w:r>
     </w:p>
     <w:p>

</xml_diff>